<commit_message>
release: promote staging to prod (GC templates + options + description, formatting, NOTES box, hard bid removed, test speed-up)
#601 #602 #603 #604 #605 #606 #607 #608 #609 #610. Tree byte-identical to origin/staging 8708a75.

Co-Authored-By: Claude Opus 5.5 (1M context) <noreply@anthropic.com>
</commit_message>
<xml_diff>
--- a/backend/templates/GC/xx TREADWELL POLISH PROPOSAL - xx.docx
+++ b/backend/templates/GC/xx TREADWELL POLISH PROPOSAL - xx.docx
@@ -1,6 +1,6 @@
 
 <file path=word/document.xml><?xml version="1.0" encoding="utf-8"?>
-<w:document xmlns:wpc="http://schemas.microsoft.com/office/word/2010/wordprocessingCanvas" xmlns:cx="http://schemas.microsoft.com/office/drawing/2014/chartex" xmlns:cx1="http://schemas.microsoft.com/office/drawing/2015/9/8/chartex" xmlns:cx2="http://schemas.microsoft.com/office/drawing/2015/10/21/chartex" xmlns:cx3="http://schemas.microsoft.com/office/drawing/2016/5/9/chartex" xmlns:cx4="http://schemas.microsoft.com/office/drawing/2016/5/10/chartex" xmlns:cx5="http://schemas.microsoft.com/office/drawing/2016/5/11/chartex" xmlns:cx6="http://schemas.microsoft.com/office/drawing/2016/5/12/chartex" xmlns:cx7="http://schemas.microsoft.com/office/drawing/2016/5/13/chartex" xmlns:cx8="http://schemas.microsoft.com/office/drawing/2016/5/14/chartex" xmlns:mc="http://schemas.openxmlformats.org/markup-compatibility/2006" xmlns:aink="http://schemas.microsoft.com/office/drawing/2016/ink" xmlns:am3d="http://schemas.microsoft.com/office/drawing/2017/model3d" xmlns:o="urn:schemas-microsoft-com:office:office" xmlns:oel="http://schemas.microsoft.com/office/2019/extlst" xmlns:r="http://schemas.openxmlformats.org/officeDocument/2006/relationships" xmlns:m="http://schemas.openxmlformats.org/officeDocument/2006/math" xmlns:v="urn:schemas-microsoft-com:vml" xmlns:wp14="http://schemas.microsoft.com/office/word/2010/wordprocessingDrawing" xmlns:wp="http://schemas.openxmlformats.org/drawingml/2006/wordprocessingDrawing" xmlns:w10="urn:schemas-microsoft-com:office:word" xmlns:w="http://schemas.openxmlformats.org/wordprocessingml/2006/main" xmlns:w14="http://schemas.microsoft.com/office/word/2010/wordml" xmlns:w15="http://schemas.microsoft.com/office/word/2012/wordml" xmlns:w16cex="http://schemas.microsoft.com/office/word/2018/wordml/cex" xmlns:w16cid="http://schemas.microsoft.com/office/word/2016/wordml/cid" xmlns:w16="http://schemas.microsoft.com/office/word/2018/wordml" xmlns:w16du="http://schemas.microsoft.com/office/word/2023/wordml/word16du" xmlns:w16sdtdh="http://schemas.microsoft.com/office/word/2020/wordml/sdtdatahash" xmlns:w16sdtfl="http://schemas.microsoft.com/office/word/2024/wordml/sdtformatlock" xmlns:w16se="http://schemas.microsoft.com/office/word/2015/wordml/symex" xmlns:wpg="http://schemas.microsoft.com/office/word/2010/wordprocessingGroup" xmlns:wpi="http://schemas.microsoft.com/office/word/2010/wordprocessingInk" xmlns:wne="http://schemas.microsoft.com/office/word/2006/wordml" xmlns:wps="http://schemas.microsoft.com/office/word/2010/wordprocessingShape" mc:Ignorable="w14 w15 w16se w16cid w16 w16cex w16sdtdh w16sdtfl w16du wp14">
+<w:document xmlns:wpc="http://schemas.microsoft.com/office/word/2010/wordprocessingCanvas" xmlns:cx="http://schemas.microsoft.com/office/drawing/2014/chartex" xmlns:cx1="http://schemas.microsoft.com/office/drawing/2015/9/8/chartex" xmlns:cx2="http://schemas.microsoft.com/office/drawing/2015/10/21/chartex" xmlns:cx3="http://schemas.microsoft.com/office/drawing/2016/5/9/chartex" xmlns:cx4="http://schemas.microsoft.com/office/drawing/2016/5/10/chartex" xmlns:cx5="http://schemas.microsoft.com/office/drawing/2016/5/11/chartex" xmlns:cx6="http://schemas.microsoft.com/office/drawing/2016/5/12/chartex" xmlns:cx7="http://schemas.microsoft.com/office/drawing/2016/5/13/chartex" xmlns:cx8="http://schemas.microsoft.com/office/drawing/2016/5/14/chartex" xmlns:mc="http://schemas.openxmlformats.org/markup-compatibility/2006" xmlns:m="http://schemas.openxmlformats.org/officeDocument/2006/math" xmlns:aink="http://schemas.microsoft.com/office/drawing/2016/ink" xmlns:am3d="http://schemas.microsoft.com/office/drawing/2017/model3d" xmlns:oel="http://schemas.microsoft.com/office/2019/extlst" xmlns:r="http://schemas.openxmlformats.org/officeDocument/2006/relationships" xmlns:wp14="http://schemas.microsoft.com/office/word/2010/wordprocessingDrawing" xmlns:wp="http://schemas.openxmlformats.org/drawingml/2006/wordprocessingDrawing" xmlns:wpg="http://schemas.microsoft.com/office/word/2010/wordprocessingGroup" xmlns:wpi="http://schemas.microsoft.com/office/word/2010/wordprocessingInk" xmlns:wps="http://schemas.microsoft.com/office/word/2010/wordprocessingShape" xmlns:o="urn:schemas-microsoft-com:office:office" xmlns:v="urn:schemas-microsoft-com:vml" xmlns:w10="urn:schemas-microsoft-com:office:word" xmlns:w="http://schemas.openxmlformats.org/wordprocessingml/2006/main" xmlns:w14="http://schemas.microsoft.com/office/word/2010/wordml" xmlns:w15="http://schemas.microsoft.com/office/word/2012/wordml" xmlns:w16cex="http://schemas.microsoft.com/office/word/2018/wordml/cex" xmlns:w16cid="http://schemas.microsoft.com/office/word/2016/wordml/cid" xmlns:w16="http://schemas.microsoft.com/office/word/2018/wordml" xmlns:w16sdtdh="http://schemas.microsoft.com/office/word/2020/wordml/sdtdatahash" xmlns:w16sdtfl="http://schemas.microsoft.com/office/word/2024/wordml/sdtformatlock" xmlns:w16se="http://schemas.microsoft.com/office/word/2015/wordml/symex" xmlns:w16du="http://schemas.microsoft.com/office/word/2023/wordml/word16du" xmlns:wne="http://schemas.microsoft.com/office/word/2006/wordml" mc:Ignorable="w14 w15 w16se w16cid w16 w16cex w16sdtdh w16sdtfl w16du wp14">
   <w:body>
     <w:p>
       <w:r>
@@ -137,7 +137,7 @@
                                 <w:sz w:val="18"/>
                                 <w:szCs w:val="18"/>
                               </w:rPr>
-                              <w:t>xx</w:t>
+                              <w:t xml:space="preserve">{{job_name}}</w:t>
                             </w:r>
                           </w:p>
                           <w:p>
@@ -161,16 +161,16 @@
                                 <w:sz w:val="18"/>
                                 <w:szCs w:val="18"/>
                               </w:rPr>
-                              <w:t>xx, KS</w:t>
-                            </w:r>
-                            <w:r>
-                              <w:rPr>
-                                <w:rFonts w:ascii="Zetta Serif Book" w:hAnsi="Zetta Serif Book"/>
-                                <w:color w:val="404040" w:themeColor="text1" w:themeTint="BF"/>
-                                <w:sz w:val="18"/>
-                                <w:szCs w:val="18"/>
-                              </w:rPr>
-                              <w:t xml:space="preserve"> </w:t>
+                              <w:t xml:space="preserve">{{city_state}}</w:t>
+                            </w:r>
+                            <w:r>
+                              <w:rPr>
+                                <w:rFonts w:ascii="Zetta Serif Book" w:hAnsi="Zetta Serif Book"/>
+                                <w:color w:val="404040" w:themeColor="text1" w:themeTint="BF"/>
+                                <w:sz w:val="18"/>
+                                <w:szCs w:val="18"/>
+                              </w:rPr>
+                              <w:t xml:space="preserve"/>
                             </w:r>
                           </w:p>
                           <w:p>
@@ -194,7 +194,7 @@
                                 <w:sz w:val="18"/>
                                 <w:szCs w:val="18"/>
                               </w:rPr>
-                              <w:t xml:space="preserve">xx, MO </w:t>
+                              <w:t xml:space="preserve"/>
                             </w:r>
                           </w:p>
                           <w:p>
@@ -261,7 +261,7 @@
               </wp:anchor>
             </w:drawing>
           </mc:Choice>
-          <mc:Fallback>
+          <mc:Fallback xmlns:w16cei="http://schemas.microsoft.com/office/word/2026/wordml/cei">
             <w:pict>
               <v:shapetype w14:anchorId="149BED7D" id="_x0000_t202" coordsize="21600,21600" o:spt="202" path="m,l,21600r21600,l21600,xe">
                 <v:stroke joinstyle="miter"/>
@@ -291,7 +291,7 @@
                           <w:sz w:val="18"/>
                           <w:szCs w:val="18"/>
                         </w:rPr>
-                        <w:t>xx</w:t>
+                        <w:t xml:space="preserve">{{job_name}}</w:t>
                       </w:r>
                     </w:p>
                     <w:p>
@@ -315,16 +315,16 @@
                           <w:sz w:val="18"/>
                           <w:szCs w:val="18"/>
                         </w:rPr>
-                        <w:t>xx, KS</w:t>
-                      </w:r>
-                      <w:r>
-                        <w:rPr>
-                          <w:rFonts w:ascii="Zetta Serif Book" w:hAnsi="Zetta Serif Book"/>
-                          <w:color w:val="404040" w:themeColor="text1" w:themeTint="BF"/>
-                          <w:sz w:val="18"/>
-                          <w:szCs w:val="18"/>
-                        </w:rPr>
-                        <w:t xml:space="preserve"> </w:t>
+                        <w:t xml:space="preserve">{{city_state}}</w:t>
+                      </w:r>
+                      <w:r>
+                        <w:rPr>
+                          <w:rFonts w:ascii="Zetta Serif Book" w:hAnsi="Zetta Serif Book"/>
+                          <w:color w:val="404040" w:themeColor="text1" w:themeTint="BF"/>
+                          <w:sz w:val="18"/>
+                          <w:szCs w:val="18"/>
+                        </w:rPr>
+                        <w:t xml:space="preserve"/>
                       </w:r>
                     </w:p>
                     <w:p>
@@ -348,7 +348,7 @@
                           <w:sz w:val="18"/>
                           <w:szCs w:val="18"/>
                         </w:rPr>
-                        <w:t xml:space="preserve">xx, MO </w:t>
+                        <w:t xml:space="preserve"/>
                       </w:r>
                     </w:p>
                     <w:p>
@@ -769,7 +769,7 @@
               </wp:anchor>
             </w:drawing>
           </mc:Choice>
-          <mc:Fallback>
+          <mc:Fallback xmlns:w16cei="http://schemas.microsoft.com/office/word/2026/wordml/cei">
             <w:pict>
               <v:shape w14:anchorId="688E2791" id="Text Box 16" o:spid="_x0000_s1028" type="#_x0000_t202" style="position:absolute;margin-left:-62.65pt;margin-top:6in;width:90pt;height:90pt;z-index:251674624;visibility:visible;mso-wrap-style:square;mso-width-percent:0;mso-height-percent:0;mso-wrap-distance-left:9pt;mso-wrap-distance-top:0;mso-wrap-distance-right:9pt;mso-wrap-distance-bottom:0;mso-position-horizontal:absolute;mso-position-horizontal-relative:text;mso-position-vertical:absolute;mso-position-vertical-relative:text;mso-width-percent:0;mso-height-percent:0;mso-width-relative:margin;mso-height-relative:margin;v-text-anchor:top" o:gfxdata="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" filled="f" stroked="f">
                 <v:textbox inset="0,0,0,0">
@@ -982,7 +982,7 @@
                                 <w:szCs w:val="18"/>
                                 <w:u w:val="single"/>
                               </w:rPr>
-                              <w:t xml:space="preserve"> Spec 03</w:t>
+                              <w:t xml:space="preserve"> Spec {{spec_section}}</w:t>
                             </w:r>
                             <w:r>
                               <w:rPr>
@@ -993,7 +993,7 @@
                                 <w:highlight w:val="yellow"/>
                                 <w:u w:val="single"/>
                               </w:rPr>
-                              <w:t>3543</w:t>
+                              <w:t xml:space="preserve"/>
                             </w:r>
                             <w:r>
                               <w:rPr>
@@ -1053,7 +1053,7 @@
                                 <w:szCs w:val="18"/>
                                 <w:u w:val="single"/>
                               </w:rPr>
-                              <w:t xml:space="preserve">xx Architects </w:t>
+                              <w:t xml:space="preserve">{{architect}} </w:t>
                             </w:r>
                             <w:r>
                               <w:rPr>
@@ -1083,7 +1083,7 @@
                                 <w:szCs w:val="18"/>
                                 <w:u w:val="single"/>
                               </w:rPr>
-                              <w:t>4</w:t>
+                              <w:t xml:space="preserve">{{drawings_dated_formatted}}</w:t>
                             </w:r>
                             <w:r>
                               <w:rPr>
@@ -1093,7 +1093,7 @@
                                 <w:szCs w:val="18"/>
                                 <w:u w:val="single"/>
                               </w:rPr>
-                              <w:t>/1/2</w:t>
+                              <w:t xml:space="preserve"/>
                             </w:r>
                             <w:r>
                               <w:rPr>
@@ -1103,7 +1103,7 @@
                                 <w:szCs w:val="18"/>
                                 <w:u w:val="single"/>
                               </w:rPr>
-                              <w:t>6</w:t>
+                              <w:t xml:space="preserve"/>
                             </w:r>
                             <w:r>
                               <w:rPr>
@@ -1569,6 +1569,7 @@
                               </w:rPr>
                               <w:t>” c</w:t>
                             </w:r>
+                            <w:proofErr w:type="spellStart"/>
                             <w:r>
                               <w:rPr>
                                 <w:rFonts w:ascii="Zetta Serif Book" w:hAnsi="Zetta Serif Book"/>
@@ -1577,7 +1578,18 @@
                                 <w:szCs w:val="16"/>
                                 <w:highlight w:val="green"/>
                               </w:rPr>
-                              <w:t>ut-depth</w:t>
+                              <w:t>ut</w:t>
+                            </w:r>
+                            <w:proofErr w:type="spellEnd"/>
+                            <w:r>
+                              <w:rPr>
+                                <w:rFonts w:ascii="Zetta Serif Book" w:hAnsi="Zetta Serif Book"/>
+                                <w:color w:val="404040" w:themeColor="text1" w:themeTint="BF"/>
+                                <w:sz w:val="16"/>
+                                <w:szCs w:val="16"/>
+                                <w:highlight w:val="green"/>
+                              </w:rPr>
+                              <w:t>-depth</w:t>
                             </w:r>
                             <w:r>
                               <w:rPr>
@@ -1625,7 +1637,7 @@
                                 <w:sz w:val="18"/>
                                 <w:szCs w:val="18"/>
                               </w:rPr>
-                              <w:t xml:space="preserve">Area:~{{sqft}} sf of polished concrete flooring [PC] per the Finish Schedule on A900</w:t>
+                              <w:t xml:space="preserve">Area:~{{sqft}} sf of polished concrete flooring [{{finish_tag}}] per the Finish Schedule on {{plan_sheet}}</w:t>
                             </w:r>
                             <w:r>
                               <w:rPr>
@@ -2549,11 +2561,7 @@
           </mc:Choice>
           <mc:Fallback>
             <w:pict>
-              <v:shapetype w14:anchorId="16600D86" id="_x0000_t202" coordsize="21600,21600" o:spt="202" path="m,l,21600r21600,l21600,xe">
-                <v:stroke joinstyle="miter"/>
-                <v:path gradientshapeok="t" o:connecttype="rect"/>
-              </v:shapetype>
-              <v:shape id="Text Box 24" o:spid="_x0000_s1029" type="#_x0000_t202" style="position:absolute;margin-left:70.7pt;margin-top:11.65pt;width:423pt;height:182.15pt;z-index:251682816;visibility:visible;mso-wrap-style:square;mso-width-percent:0;mso-height-percent:0;mso-wrap-distance-left:9pt;mso-wrap-distance-top:0;mso-wrap-distance-right:9pt;mso-wrap-distance-bottom:0;mso-position-horizontal:absolute;mso-position-horizontal-relative:text;mso-position-vertical:absolute;mso-position-vertical-relative:text;mso-width-percent:0;mso-height-percent:0;mso-width-relative:margin;mso-height-relative:margin;v-text-anchor:top" o:gfxdata="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" filled="f" stroked="f">
+              <v:shape w14:anchorId="16600D86" id="Text Box 24" o:spid="_x0000_s1029" type="#_x0000_t202" style="position:absolute;margin-left:70.7pt;margin-top:11.65pt;width:423pt;height:182.15pt;z-index:251682816;visibility:visible;mso-wrap-style:square;mso-width-percent:0;mso-height-percent:0;mso-wrap-distance-left:9pt;mso-wrap-distance-top:0;mso-wrap-distance-right:9pt;mso-wrap-distance-bottom:0;mso-position-horizontal:absolute;mso-position-horizontal-relative:text;mso-position-vertical:absolute;mso-position-vertical-relative:text;mso-width-percent:0;mso-height-percent:0;mso-width-relative:margin;mso-height-relative:margin;v-text-anchor:top" o:gfxdata="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" filled="f" stroked="f">
                 <v:textbox inset="0,0,0,0">
                   <w:txbxContent>
                     <w:p>
@@ -2628,7 +2636,7 @@
                           <w:szCs w:val="18"/>
                           <w:u w:val="single"/>
                         </w:rPr>
-                        <w:t xml:space="preserve"> Spec 03</w:t>
+                        <w:t xml:space="preserve"> Spec {{spec_section}}</w:t>
                       </w:r>
                       <w:r>
                         <w:rPr>
@@ -2639,7 +2647,7 @@
                           <w:highlight w:val="yellow"/>
                           <w:u w:val="single"/>
                         </w:rPr>
-                        <w:t>3543</w:t>
+                        <w:t xml:space="preserve"/>
                       </w:r>
                       <w:r>
                         <w:rPr>
@@ -2699,7 +2707,7 @@
                           <w:szCs w:val="18"/>
                           <w:u w:val="single"/>
                         </w:rPr>
-                        <w:t xml:space="preserve">xx Architects </w:t>
+                        <w:t xml:space="preserve">{{architect}} </w:t>
                       </w:r>
                       <w:r>
                         <w:rPr>
@@ -2729,7 +2737,7 @@
                           <w:szCs w:val="18"/>
                           <w:u w:val="single"/>
                         </w:rPr>
-                        <w:t>4</w:t>
+                        <w:t xml:space="preserve">{{drawings_dated_formatted}}</w:t>
                       </w:r>
                       <w:r>
                         <w:rPr>
@@ -2739,7 +2747,7 @@
                           <w:szCs w:val="18"/>
                           <w:u w:val="single"/>
                         </w:rPr>
-                        <w:t>/1/2</w:t>
+                        <w:t xml:space="preserve"/>
                       </w:r>
                       <w:r>
                         <w:rPr>
@@ -2749,7 +2757,7 @@
                           <w:szCs w:val="18"/>
                           <w:u w:val="single"/>
                         </w:rPr>
-                        <w:t>6</w:t>
+                        <w:t xml:space="preserve"/>
                       </w:r>
                       <w:r>
                         <w:rPr>
@@ -3215,6 +3223,7 @@
                         </w:rPr>
                         <w:t>” c</w:t>
                       </w:r>
+                      <w:proofErr w:type="spellStart"/>
                       <w:r>
                         <w:rPr>
                           <w:rFonts w:ascii="Zetta Serif Book" w:hAnsi="Zetta Serif Book"/>
@@ -3223,7 +3232,18 @@
                           <w:szCs w:val="16"/>
                           <w:highlight w:val="green"/>
                         </w:rPr>
-                        <w:t>ut-depth</w:t>
+                        <w:t>ut</w:t>
+                      </w:r>
+                      <w:proofErr w:type="spellEnd"/>
+                      <w:r>
+                        <w:rPr>
+                          <w:rFonts w:ascii="Zetta Serif Book" w:hAnsi="Zetta Serif Book"/>
+                          <w:color w:val="404040" w:themeColor="text1" w:themeTint="BF"/>
+                          <w:sz w:val="16"/>
+                          <w:szCs w:val="16"/>
+                          <w:highlight w:val="green"/>
+                        </w:rPr>
+                        <w:t>-depth</w:t>
                       </w:r>
                       <w:r>
                         <w:rPr>
@@ -3271,7 +3291,7 @@
                           <w:sz w:val="18"/>
                           <w:szCs w:val="18"/>
                         </w:rPr>
-                        <w:t xml:space="preserve">Area:~{{sqft}} sf of polished concrete flooring [PC] per the Finish Schedule on A900</w:t>
+                        <w:t xml:space="preserve">Area:~{{sqft}} sf of polished concrete flooring [{{finish_tag}}] per the Finish Schedule on {{plan_sheet}}</w:t>
                       </w:r>
                       <w:r>
                         <w:rPr>
@@ -5189,7 +5209,7 @@
               </wp:anchor>
             </w:drawing>
           </mc:Choice>
-          <mc:Fallback>
+          <mc:Fallback xmlns:w16cei="http://schemas.microsoft.com/office/word/2026/wordml/cei">
             <w:pict>
               <v:shape w14:anchorId="0163F092" id="Text Box 23" o:spid="_x0000_s1030" type="#_x0000_t202" style="position:absolute;margin-left:71.2pt;margin-top:7.35pt;width:422.65pt;height:177.1pt;z-index:251683840;visibility:visible;mso-wrap-style:square;mso-width-percent:0;mso-height-percent:0;mso-wrap-distance-left:9pt;mso-wrap-distance-top:0;mso-wrap-distance-right:9pt;mso-wrap-distance-bottom:0;mso-position-horizontal:absolute;mso-position-horizontal-relative:text;mso-position-vertical:absolute;mso-position-vertical-relative:text;mso-width-percent:0;mso-height-percent:0;mso-width-relative:margin;mso-height-relative:margin;v-text-anchor:top" o:gfxdata="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" filled="f" stroked="f">
                 <v:textbox inset="0,0,0,0">
@@ -6189,7 +6209,7 @@
               </wp:anchor>
             </w:drawing>
           </mc:Choice>
-          <mc:Fallback>
+          <mc:Fallback xmlns:w16cei="http://schemas.microsoft.com/office/word/2026/wordml/cei">
             <w:pict>
               <v:line w14:anchorId="66A55752" id="Straight Connector 1" o:spid="_x0000_s1026" style="position:absolute;z-index:251686912;visibility:visible;mso-wrap-style:square;mso-width-percent:0;mso-height-percent:0;mso-wrap-distance-left:9pt;mso-wrap-distance-top:0;mso-wrap-distance-right:9pt;mso-wrap-distance-bottom:0;mso-position-horizontal:absolute;mso-position-horizontal-relative:text;mso-position-vertical:absolute;mso-position-vertical-relative:text;mso-width-percent:0;mso-height-percent:0;mso-width-relative:margin;mso-height-relative:margin" from="44.15pt,5.55pt" to="493.75pt,5.6pt" o:gfxdata="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" strokecolor="#cb2129" strokeweight="1.25pt">
                 <v:shadow on="t" color="black" opacity="0" origin=",.5" offset="0,.55556mm"/>
@@ -7123,7 +7143,7 @@
                                 <w:szCs w:val="15"/>
                                 <w:highlight w:val="yellow"/>
                               </w:rPr>
-                              <w:t>0</w:t>
+                              <w:t xml:space="preserve">{{addenda_count}}</w:t>
                             </w:r>
                           </w:p>
                           <w:p>
@@ -7474,7 +7494,7 @@
               </wp:anchor>
             </w:drawing>
           </mc:Choice>
-          <mc:Fallback>
+          <mc:Fallback xmlns:w16cei="http://schemas.microsoft.com/office/word/2026/wordml/cei">
             <w:pict>
               <v:shape w14:anchorId="070DDC1D" id="Text Box 11" o:spid="_x0000_s1031" type="#_x0000_t202" style="position:absolute;margin-left:35pt;margin-top:1.5pt;width:422.65pt;height:189pt;z-index:251684864;visibility:visible;mso-wrap-style:square;mso-width-percent:0;mso-height-percent:0;mso-wrap-distance-left:9pt;mso-wrap-distance-top:0;mso-wrap-distance-right:9pt;mso-wrap-distance-bottom:0;mso-position-horizontal:absolute;mso-position-horizontal-relative:text;mso-position-vertical:absolute;mso-position-vertical-relative:text;mso-width-percent:0;mso-height-percent:0;mso-width-relative:margin;mso-height-relative:margin;v-text-anchor:top" o:gfxdata="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" filled="f" stroked="f">
                 <v:textbox inset="0,0,0,0">
@@ -8331,7 +8351,7 @@
                           <w:szCs w:val="15"/>
                           <w:highlight w:val="yellow"/>
                         </w:rPr>
-                        <w:t>0</w:t>
+                        <w:t xml:space="preserve">{{addenda_count}}</w:t>
                       </w:r>
                     </w:p>
                     <w:p>
@@ -9045,7 +9065,27 @@
           <w:sz w:val="18"/>
           <w:szCs w:val="18"/>
         </w:rPr>
-        <w:t>, suspension of work for non-payment or as ordered by Customer, or other delays caused by Customer or others. Should work be delayed by any of the aforementioned causes for a period exceeding ninety (90) days, Treadwell shall be entitled to terminate this Contract.   In addition, Treadwell shall be entitled to recover its costs for extended job site general conditions due to delays caused by said events or other excusable delays.</w:t>
+        <w:t xml:space="preserve">, suspension of work for non-payment or as ordered by Customer, or other delays caused by Customer or others. Should work be delayed by any of the </w:t>
+      </w:r>
+      <w:proofErr w:type="gramStart"/>
+      <w:r>
+        <w:rPr>
+          <w:rFonts w:ascii="Cambria" w:hAnsi="Cambria"/>
+          <w:bCs/>
+          <w:sz w:val="18"/>
+          <w:szCs w:val="18"/>
+        </w:rPr>
+        <w:t>aforementioned causes</w:t>
+      </w:r>
+      <w:proofErr w:type="gramEnd"/>
+      <w:r>
+        <w:rPr>
+          <w:rFonts w:ascii="Cambria" w:hAnsi="Cambria"/>
+          <w:bCs/>
+          <w:sz w:val="18"/>
+          <w:szCs w:val="18"/>
+        </w:rPr>
+        <w:t xml:space="preserve"> for a period exceeding ninety (90) days, Treadwell shall be entitled to terminate this Contract.   In addition, Treadwell shall be entitled to recover its costs for extended job site general conditions due to delays caused by said events or other excusable delays.</w:t>
       </w:r>
     </w:p>
     <w:p>
@@ -9203,7 +9243,25 @@
           <w:sz w:val="18"/>
           <w:szCs w:val="18"/>
         </w:rPr>
-        <w:t xml:space="preserve"> Treadwell takes extra care when working in finished spaces.  However, due to the types of floors we install and the equipment required there may be some wear and tear to existing finishes.  Treadwell will participate in developing a plan to minimize the impacts of the flooring installation but is not responsible for wear and tear items such as dust created from concrete prep, wall and baseboard damage from equipment use, paint removal from painter’s tape, slurry runs, scratches on finishes from equipment use and splatter from mixing process</w:t>
+        <w:t xml:space="preserve"> Treadwell takes extra care when working in finished spaces.  However, due to the types of floors we </w:t>
+      </w:r>
+      <w:proofErr w:type="gramStart"/>
+      <w:r>
+        <w:rPr>
+          <w:rFonts w:ascii="Cambria" w:hAnsi="Cambria"/>
+          <w:sz w:val="18"/>
+          <w:szCs w:val="18"/>
+        </w:rPr>
+        <w:t>install</w:t>
+      </w:r>
+      <w:proofErr w:type="gramEnd"/>
+      <w:r>
+        <w:rPr>
+          <w:rFonts w:ascii="Cambria" w:hAnsi="Cambria"/>
+          <w:sz w:val="18"/>
+          <w:szCs w:val="18"/>
+        </w:rPr>
+        <w:t xml:space="preserve"> and the equipment required there may be some wear and tear to existing finishes.  Treadwell will participate in developing a plan to minimize the impacts of the flooring installation but is not responsible for wear and tear items such as dust created from concrete prep, wall and baseboard damage from equipment use, paint removal from painter’s tape, slurry runs, scratches on finishes from equipment use and splatter from mixing process</w:t>
       </w:r>
     </w:p>
     <w:p>
@@ -9239,7 +9297,25 @@
           <w:sz w:val="18"/>
           <w:szCs w:val="18"/>
         </w:rPr>
-        <w:t xml:space="preserve">  Treadwell warrants that for one (1) year following the date of substantial completion of Treadwell's Work, it will promptly repair or replace any improper or defective workmanship or materials. This limited warranty excludes any damage or defect caused by abuse, improper or insufficient maintenance, improper operation, normal wear and tear, normal usage, or minor imperfections in the Work.  This limited warranty is Customer’s sole and exclusive remedy against Treadwell under any theory of recovery for any defective workmanship or materials. This limited warranty is not transferable or assignable to any other person or entity.  This limited warranty is expressly conditioned on: 1) Customer's timely payment to Treadwell of all amounts due for Work performed by Treadwell; 2) Customer's written notice to Treadwell within twenty (20) days after Customer first becomes aware of any such improper or defective workmanship (provided notice is provided within the one-year warranty period); and 3) Treadwell having had a reasonable opportunity to</w:t>
+        <w:t xml:space="preserve">  Treadwell warrants that for one (1) year following the date of substantial completion of Treadwell's Work, it will promptly repair or replace any improper or defective workmanship or materials. This limited warranty excludes any damage or defect caused by abuse, improper or insufficient maintenance, improper operation, normal wear and tear, normal usage, or minor imperfections in the Work.  This limited warranty is Customer’s sole and exclusive remedy against Treadwell under any theory of recovery for any defective workmanship or materials. This limited warranty is not transferable or assignable to any other person or entity.  This limited warranty is expressly conditioned </w:t>
+      </w:r>
+      <w:proofErr w:type="gramStart"/>
+      <w:r>
+        <w:rPr>
+          <w:rFonts w:ascii="Cambria" w:hAnsi="Cambria"/>
+          <w:sz w:val="18"/>
+          <w:szCs w:val="18"/>
+        </w:rPr>
+        <w:t>on:</w:t>
+      </w:r>
+      <w:proofErr w:type="gramEnd"/>
+      <w:r>
+        <w:rPr>
+          <w:rFonts w:ascii="Cambria" w:hAnsi="Cambria"/>
+          <w:sz w:val="18"/>
+          <w:szCs w:val="18"/>
+        </w:rPr>
+        <w:t xml:space="preserve"> 1) Customer's timely payment to Treadwell of all amounts due for Work performed by Treadwell; 2) Customer's written notice to Treadwell within twenty (20) days after Customer first becomes aware of any such improper or defective workmanship (provided notice is provided within the one-year warranty period); and 3) Treadwell having had a reasonable opportunity to</w:t>
       </w:r>
     </w:p>
     <w:p>
@@ -9774,7 +9850,25 @@
           <w:sz w:val="18"/>
           <w:szCs w:val="18"/>
         </w:rPr>
-        <w:t>Any claim arising out of or related to this Agreement shall be subject to mediation as a condition precedent to binding arbitration.  Unless the Parties otherwise agree, the mediation shall be administered by the American Arbitration Association (“AAA”) in accordance with its Construction Industry Mediation Procedures in effect on the date of this Agreement. The request may be made concurrently with the filing of arbitration but the mediation shall be concluded before the arbitration.  The Parties shall equally share the mediator’s fee and any filing fees.  The mediation shall be held in Johnson County, Kansas.</w:t>
+        <w:t xml:space="preserve">Any claim arising out of or related to this Agreement shall be subject to mediation as a condition precedent to binding arbitration.  Unless the Parties otherwise agree, the mediation shall be administered by the American Arbitration Association (“AAA”) in accordance with its Construction Industry Mediation Procedures in effect on the date of this Agreement. The request may be made concurrently with the filing of </w:t>
+      </w:r>
+      <w:proofErr w:type="gramStart"/>
+      <w:r>
+        <w:rPr>
+          <w:rFonts w:ascii="Cambria" w:hAnsi="Cambria"/>
+          <w:sz w:val="18"/>
+          <w:szCs w:val="18"/>
+        </w:rPr>
+        <w:t>arbitration</w:t>
+      </w:r>
+      <w:proofErr w:type="gramEnd"/>
+      <w:r>
+        <w:rPr>
+          <w:rFonts w:ascii="Cambria" w:hAnsi="Cambria"/>
+          <w:sz w:val="18"/>
+          <w:szCs w:val="18"/>
+        </w:rPr>
+        <w:t xml:space="preserve"> but the mediation shall be concluded before the arbitration.  The Parties shall equally share the mediator’s fee and any filing fees.  The mediation shall be held in Johnson County, Kansas.</w:t>
       </w:r>
     </w:p>
     <w:p>
@@ -10209,13 +10303,23 @@
         </w:rPr>
         <w:t xml:space="preserve">Severability.  </w:t>
       </w:r>
+      <w:proofErr w:type="gramStart"/>
       <w:r>
         <w:rPr>
           <w:rFonts w:ascii="Cambria" w:hAnsi="Cambria"/>
           <w:sz w:val="18"/>
           <w:szCs w:val="18"/>
         </w:rPr>
-        <w:t xml:space="preserve">In the event that one or more of the provisions in this Agreement are, for any reason, held to be invalid, illegal, or unenforceable in any respect, such invalidity, illegality, or unenforceability shall not affect any other provision of this Agreement. </w:t>
+        <w:t>In the event that</w:t>
+      </w:r>
+      <w:proofErr w:type="gramEnd"/>
+      <w:r>
+        <w:rPr>
+          <w:rFonts w:ascii="Cambria" w:hAnsi="Cambria"/>
+          <w:sz w:val="18"/>
+          <w:szCs w:val="18"/>
+        </w:rPr>
+        <w:t xml:space="preserve"> one or more of the provisions in this Agreement are, for any reason, held to be invalid, illegal, or unenforceable in any respect, such invalidity, illegality, or unenforceability shall not affect any other provision of this Agreement. </w:t>
       </w:r>
     </w:p>
     <w:p>
@@ -10410,7 +10514,7 @@
 </file>
 
 <file path=word/endnotes.xml><?xml version="1.0" encoding="utf-8"?>
-<w:endnotes xmlns:wpc="http://schemas.microsoft.com/office/word/2010/wordprocessingCanvas" xmlns:cx="http://schemas.microsoft.com/office/drawing/2014/chartex" xmlns:cx1="http://schemas.microsoft.com/office/drawing/2015/9/8/chartex" xmlns:cx2="http://schemas.microsoft.com/office/drawing/2015/10/21/chartex" xmlns:cx3="http://schemas.microsoft.com/office/drawing/2016/5/9/chartex" xmlns:cx4="http://schemas.microsoft.com/office/drawing/2016/5/10/chartex" xmlns:cx5="http://schemas.microsoft.com/office/drawing/2016/5/11/chartex" xmlns:cx6="http://schemas.microsoft.com/office/drawing/2016/5/12/chartex" xmlns:cx7="http://schemas.microsoft.com/office/drawing/2016/5/13/chartex" xmlns:cx8="http://schemas.microsoft.com/office/drawing/2016/5/14/chartex" xmlns:mc="http://schemas.openxmlformats.org/markup-compatibility/2006" xmlns:aink="http://schemas.microsoft.com/office/drawing/2016/ink" xmlns:am3d="http://schemas.microsoft.com/office/drawing/2017/model3d" xmlns:o="urn:schemas-microsoft-com:office:office" xmlns:oel="http://schemas.microsoft.com/office/2019/extlst" xmlns:r="http://schemas.openxmlformats.org/officeDocument/2006/relationships" xmlns:m="http://schemas.openxmlformats.org/officeDocument/2006/math" xmlns:v="urn:schemas-microsoft-com:vml" xmlns:wp14="http://schemas.microsoft.com/office/word/2010/wordprocessingDrawing" xmlns:wp="http://schemas.openxmlformats.org/drawingml/2006/wordprocessingDrawing" xmlns:w10="urn:schemas-microsoft-com:office:word" xmlns:w="http://schemas.openxmlformats.org/wordprocessingml/2006/main" xmlns:w14="http://schemas.microsoft.com/office/word/2010/wordml" xmlns:w15="http://schemas.microsoft.com/office/word/2012/wordml" xmlns:w16cex="http://schemas.microsoft.com/office/word/2018/wordml/cex" xmlns:w16cid="http://schemas.microsoft.com/office/word/2016/wordml/cid" xmlns:w16="http://schemas.microsoft.com/office/word/2018/wordml" xmlns:w16du="http://schemas.microsoft.com/office/word/2023/wordml/word16du" xmlns:w16sdtdh="http://schemas.microsoft.com/office/word/2020/wordml/sdtdatahash" xmlns:w16sdtfl="http://schemas.microsoft.com/office/word/2024/wordml/sdtformatlock" xmlns:w16se="http://schemas.microsoft.com/office/word/2015/wordml/symex" xmlns:wpg="http://schemas.microsoft.com/office/word/2010/wordprocessingGroup" xmlns:wpi="http://schemas.microsoft.com/office/word/2010/wordprocessingInk" xmlns:wne="http://schemas.microsoft.com/office/word/2006/wordml" xmlns:wps="http://schemas.microsoft.com/office/word/2010/wordprocessingShape" mc:Ignorable="w14 w15 w16se w16cid w16 w16cex w16sdtdh w16sdtfl w16du wp14">
+<w:endnotes xmlns:wpc="http://schemas.microsoft.com/office/word/2010/wordprocessingCanvas" xmlns:cx="http://schemas.microsoft.com/office/drawing/2014/chartex" xmlns:cx1="http://schemas.microsoft.com/office/drawing/2015/9/8/chartex" xmlns:cx2="http://schemas.microsoft.com/office/drawing/2015/10/21/chartex" xmlns:cx3="http://schemas.microsoft.com/office/drawing/2016/5/9/chartex" xmlns:cx4="http://schemas.microsoft.com/office/drawing/2016/5/10/chartex" xmlns:cx5="http://schemas.microsoft.com/office/drawing/2016/5/11/chartex" xmlns:cx6="http://schemas.microsoft.com/office/drawing/2016/5/12/chartex" xmlns:cx7="http://schemas.microsoft.com/office/drawing/2016/5/13/chartex" xmlns:cx8="http://schemas.microsoft.com/office/drawing/2016/5/14/chartex" xmlns:mc="http://schemas.openxmlformats.org/markup-compatibility/2006" xmlns:m="http://schemas.openxmlformats.org/officeDocument/2006/math" xmlns:aink="http://schemas.microsoft.com/office/drawing/2016/ink" xmlns:am3d="http://schemas.microsoft.com/office/drawing/2017/model3d" xmlns:oel="http://schemas.microsoft.com/office/2019/extlst" xmlns:r="http://schemas.openxmlformats.org/officeDocument/2006/relationships" xmlns:wp14="http://schemas.microsoft.com/office/word/2010/wordprocessingDrawing" xmlns:wp="http://schemas.openxmlformats.org/drawingml/2006/wordprocessingDrawing" xmlns:wpg="http://schemas.microsoft.com/office/word/2010/wordprocessingGroup" xmlns:wpi="http://schemas.microsoft.com/office/word/2010/wordprocessingInk" xmlns:wps="http://schemas.microsoft.com/office/word/2010/wordprocessingShape" xmlns:o="urn:schemas-microsoft-com:office:office" xmlns:v="urn:schemas-microsoft-com:vml" xmlns:w10="urn:schemas-microsoft-com:office:word" xmlns:w="http://schemas.openxmlformats.org/wordprocessingml/2006/main" xmlns:w14="http://schemas.microsoft.com/office/word/2010/wordml" xmlns:w15="http://schemas.microsoft.com/office/word/2012/wordml" xmlns:w16cex="http://schemas.microsoft.com/office/word/2018/wordml/cex" xmlns:w16cid="http://schemas.microsoft.com/office/word/2016/wordml/cid" xmlns:w16="http://schemas.microsoft.com/office/word/2018/wordml" xmlns:w16sdtdh="http://schemas.microsoft.com/office/word/2020/wordml/sdtdatahash" xmlns:w16sdtfl="http://schemas.microsoft.com/office/word/2024/wordml/sdtformatlock" xmlns:w16se="http://schemas.microsoft.com/office/word/2015/wordml/symex" xmlns:w16du="http://schemas.microsoft.com/office/word/2023/wordml/word16du" xmlns:wne="http://schemas.microsoft.com/office/word/2006/wordml" mc:Ignorable="w14 w15 w16se w16cid w16 w16cex w16sdtdh w16sdtfl w16du wp14">
   <w:endnote w:type="separator" w:id="-1">
     <w:p>
       <w:r>
@@ -10429,7 +10533,7 @@
 </file>
 
 <file path=word/footnotes.xml><?xml version="1.0" encoding="utf-8"?>
-<w:footnotes xmlns:wpc="http://schemas.microsoft.com/office/word/2010/wordprocessingCanvas" xmlns:cx="http://schemas.microsoft.com/office/drawing/2014/chartex" xmlns:cx1="http://schemas.microsoft.com/office/drawing/2015/9/8/chartex" xmlns:cx2="http://schemas.microsoft.com/office/drawing/2015/10/21/chartex" xmlns:cx3="http://schemas.microsoft.com/office/drawing/2016/5/9/chartex" xmlns:cx4="http://schemas.microsoft.com/office/drawing/2016/5/10/chartex" xmlns:cx5="http://schemas.microsoft.com/office/drawing/2016/5/11/chartex" xmlns:cx6="http://schemas.microsoft.com/office/drawing/2016/5/12/chartex" xmlns:cx7="http://schemas.microsoft.com/office/drawing/2016/5/13/chartex" xmlns:cx8="http://schemas.microsoft.com/office/drawing/2016/5/14/chartex" xmlns:mc="http://schemas.openxmlformats.org/markup-compatibility/2006" xmlns:aink="http://schemas.microsoft.com/office/drawing/2016/ink" xmlns:am3d="http://schemas.microsoft.com/office/drawing/2017/model3d" xmlns:o="urn:schemas-microsoft-com:office:office" xmlns:oel="http://schemas.microsoft.com/office/2019/extlst" xmlns:r="http://schemas.openxmlformats.org/officeDocument/2006/relationships" xmlns:m="http://schemas.openxmlformats.org/officeDocument/2006/math" xmlns:v="urn:schemas-microsoft-com:vml" xmlns:wp14="http://schemas.microsoft.com/office/word/2010/wordprocessingDrawing" xmlns:wp="http://schemas.openxmlformats.org/drawingml/2006/wordprocessingDrawing" xmlns:w10="urn:schemas-microsoft-com:office:word" xmlns:w="http://schemas.openxmlformats.org/wordprocessingml/2006/main" xmlns:w14="http://schemas.microsoft.com/office/word/2010/wordml" xmlns:w15="http://schemas.microsoft.com/office/word/2012/wordml" xmlns:w16cex="http://schemas.microsoft.com/office/word/2018/wordml/cex" xmlns:w16cid="http://schemas.microsoft.com/office/word/2016/wordml/cid" xmlns:w16="http://schemas.microsoft.com/office/word/2018/wordml" xmlns:w16du="http://schemas.microsoft.com/office/word/2023/wordml/word16du" xmlns:w16sdtdh="http://schemas.microsoft.com/office/word/2020/wordml/sdtdatahash" xmlns:w16sdtfl="http://schemas.microsoft.com/office/word/2024/wordml/sdtformatlock" xmlns:w16se="http://schemas.microsoft.com/office/word/2015/wordml/symex" xmlns:wpg="http://schemas.microsoft.com/office/word/2010/wordprocessingGroup" xmlns:wpi="http://schemas.microsoft.com/office/word/2010/wordprocessingInk" xmlns:wne="http://schemas.microsoft.com/office/word/2006/wordml" xmlns:wps="http://schemas.microsoft.com/office/word/2010/wordprocessingShape" mc:Ignorable="w14 w15 w16se w16cid w16 w16cex w16sdtdh w16sdtfl w16du wp14">
+<w:footnotes xmlns:wpc="http://schemas.microsoft.com/office/word/2010/wordprocessingCanvas" xmlns:cx="http://schemas.microsoft.com/office/drawing/2014/chartex" xmlns:cx1="http://schemas.microsoft.com/office/drawing/2015/9/8/chartex" xmlns:cx2="http://schemas.microsoft.com/office/drawing/2015/10/21/chartex" xmlns:cx3="http://schemas.microsoft.com/office/drawing/2016/5/9/chartex" xmlns:cx4="http://schemas.microsoft.com/office/drawing/2016/5/10/chartex" xmlns:cx5="http://schemas.microsoft.com/office/drawing/2016/5/11/chartex" xmlns:cx6="http://schemas.microsoft.com/office/drawing/2016/5/12/chartex" xmlns:cx7="http://schemas.microsoft.com/office/drawing/2016/5/13/chartex" xmlns:cx8="http://schemas.microsoft.com/office/drawing/2016/5/14/chartex" xmlns:mc="http://schemas.openxmlformats.org/markup-compatibility/2006" xmlns:m="http://schemas.openxmlformats.org/officeDocument/2006/math" xmlns:aink="http://schemas.microsoft.com/office/drawing/2016/ink" xmlns:am3d="http://schemas.microsoft.com/office/drawing/2017/model3d" xmlns:oel="http://schemas.microsoft.com/office/2019/extlst" xmlns:r="http://schemas.openxmlformats.org/officeDocument/2006/relationships" xmlns:wp14="http://schemas.microsoft.com/office/word/2010/wordprocessingDrawing" xmlns:wp="http://schemas.openxmlformats.org/drawingml/2006/wordprocessingDrawing" xmlns:wpg="http://schemas.microsoft.com/office/word/2010/wordprocessingGroup" xmlns:wpi="http://schemas.microsoft.com/office/word/2010/wordprocessingInk" xmlns:wps="http://schemas.microsoft.com/office/word/2010/wordprocessingShape" xmlns:o="urn:schemas-microsoft-com:office:office" xmlns:v="urn:schemas-microsoft-com:vml" xmlns:w10="urn:schemas-microsoft-com:office:word" xmlns:w="http://schemas.openxmlformats.org/wordprocessingml/2006/main" xmlns:w14="http://schemas.microsoft.com/office/word/2010/wordml" xmlns:w15="http://schemas.microsoft.com/office/word/2012/wordml" xmlns:w16cex="http://schemas.microsoft.com/office/word/2018/wordml/cex" xmlns:w16cid="http://schemas.microsoft.com/office/word/2016/wordml/cid" xmlns:w16="http://schemas.microsoft.com/office/word/2018/wordml" xmlns:w16sdtdh="http://schemas.microsoft.com/office/word/2020/wordml/sdtdatahash" xmlns:w16sdtfl="http://schemas.microsoft.com/office/word/2024/wordml/sdtformatlock" xmlns:w16se="http://schemas.microsoft.com/office/word/2015/wordml/symex" xmlns:w16du="http://schemas.microsoft.com/office/word/2023/wordml/word16du" xmlns:wne="http://schemas.microsoft.com/office/word/2006/wordml" mc:Ignorable="w14 w15 w16se w16cid w16 w16cex w16sdtdh w16sdtfl w16du wp14">
   <w:footnote w:type="separator" w:id="-1">
     <w:p>
       <w:r>
@@ -10448,7 +10552,7 @@
 </file>
 
 <file path=word/numbering.xml><?xml version="1.0" encoding="utf-8"?>
-<w:numbering xmlns:wpc="http://schemas.microsoft.com/office/word/2010/wordprocessingCanvas" xmlns:cx="http://schemas.microsoft.com/office/drawing/2014/chartex" xmlns:cx1="http://schemas.microsoft.com/office/drawing/2015/9/8/chartex" xmlns:cx2="http://schemas.microsoft.com/office/drawing/2015/10/21/chartex" xmlns:cx3="http://schemas.microsoft.com/office/drawing/2016/5/9/chartex" xmlns:cx4="http://schemas.microsoft.com/office/drawing/2016/5/10/chartex" xmlns:cx5="http://schemas.microsoft.com/office/drawing/2016/5/11/chartex" xmlns:cx6="http://schemas.microsoft.com/office/drawing/2016/5/12/chartex" xmlns:cx7="http://schemas.microsoft.com/office/drawing/2016/5/13/chartex" xmlns:cx8="http://schemas.microsoft.com/office/drawing/2016/5/14/chartex" xmlns:mc="http://schemas.openxmlformats.org/markup-compatibility/2006" xmlns:aink="http://schemas.microsoft.com/office/drawing/2016/ink" xmlns:am3d="http://schemas.microsoft.com/office/drawing/2017/model3d" xmlns:o="urn:schemas-microsoft-com:office:office" xmlns:oel="http://schemas.microsoft.com/office/2019/extlst" xmlns:r="http://schemas.openxmlformats.org/officeDocument/2006/relationships" xmlns:m="http://schemas.openxmlformats.org/officeDocument/2006/math" xmlns:v="urn:schemas-microsoft-com:vml" xmlns:wp14="http://schemas.microsoft.com/office/word/2010/wordprocessingDrawing" xmlns:wp="http://schemas.openxmlformats.org/drawingml/2006/wordprocessingDrawing" xmlns:w10="urn:schemas-microsoft-com:office:word" xmlns:w="http://schemas.openxmlformats.org/wordprocessingml/2006/main" xmlns:w14="http://schemas.microsoft.com/office/word/2010/wordml" xmlns:w15="http://schemas.microsoft.com/office/word/2012/wordml" xmlns:w16cex="http://schemas.microsoft.com/office/word/2018/wordml/cex" xmlns:w16cid="http://schemas.microsoft.com/office/word/2016/wordml/cid" xmlns:w16="http://schemas.microsoft.com/office/word/2018/wordml" xmlns:w16du="http://schemas.microsoft.com/office/word/2023/wordml/word16du" xmlns:w16sdtdh="http://schemas.microsoft.com/office/word/2020/wordml/sdtdatahash" xmlns:w16sdtfl="http://schemas.microsoft.com/office/word/2024/wordml/sdtformatlock" xmlns:w16se="http://schemas.microsoft.com/office/word/2015/wordml/symex" xmlns:wpg="http://schemas.microsoft.com/office/word/2010/wordprocessingGroup" xmlns:wpi="http://schemas.microsoft.com/office/word/2010/wordprocessingInk" xmlns:wne="http://schemas.microsoft.com/office/word/2006/wordml" xmlns:wps="http://schemas.microsoft.com/office/word/2010/wordprocessingShape" mc:Ignorable="w14 w15 w16se w16cid w16 w16cex w16sdtdh w16sdtfl w16du wp14">
+<w:numbering xmlns:wpc="http://schemas.microsoft.com/office/word/2010/wordprocessingCanvas" xmlns:cx="http://schemas.microsoft.com/office/drawing/2014/chartex" xmlns:cx1="http://schemas.microsoft.com/office/drawing/2015/9/8/chartex" xmlns:cx2="http://schemas.microsoft.com/office/drawing/2015/10/21/chartex" xmlns:cx3="http://schemas.microsoft.com/office/drawing/2016/5/9/chartex" xmlns:cx4="http://schemas.microsoft.com/office/drawing/2016/5/10/chartex" xmlns:cx5="http://schemas.microsoft.com/office/drawing/2016/5/11/chartex" xmlns:cx6="http://schemas.microsoft.com/office/drawing/2016/5/12/chartex" xmlns:cx7="http://schemas.microsoft.com/office/drawing/2016/5/13/chartex" xmlns:cx8="http://schemas.microsoft.com/office/drawing/2016/5/14/chartex" xmlns:mc="http://schemas.openxmlformats.org/markup-compatibility/2006" xmlns:m="http://schemas.openxmlformats.org/officeDocument/2006/math" xmlns:aink="http://schemas.microsoft.com/office/drawing/2016/ink" xmlns:am3d="http://schemas.microsoft.com/office/drawing/2017/model3d" xmlns:oel="http://schemas.microsoft.com/office/2019/extlst" xmlns:r="http://schemas.openxmlformats.org/officeDocument/2006/relationships" xmlns:wp14="http://schemas.microsoft.com/office/word/2010/wordprocessingDrawing" xmlns:wp="http://schemas.openxmlformats.org/drawingml/2006/wordprocessingDrawing" xmlns:wpg="http://schemas.microsoft.com/office/word/2010/wordprocessingGroup" xmlns:wpi="http://schemas.microsoft.com/office/word/2010/wordprocessingInk" xmlns:wps="http://schemas.microsoft.com/office/word/2010/wordprocessingShape" xmlns:o="urn:schemas-microsoft-com:office:office" xmlns:v="urn:schemas-microsoft-com:vml" xmlns:w10="urn:schemas-microsoft-com:office:word" xmlns:w="http://schemas.openxmlformats.org/wordprocessingml/2006/main" xmlns:w14="http://schemas.microsoft.com/office/word/2010/wordml" xmlns:w15="http://schemas.microsoft.com/office/word/2012/wordml" xmlns:w16cex="http://schemas.microsoft.com/office/word/2018/wordml/cex" xmlns:w16cid="http://schemas.microsoft.com/office/word/2016/wordml/cid" xmlns:w16="http://schemas.microsoft.com/office/word/2018/wordml" xmlns:w16sdtdh="http://schemas.microsoft.com/office/word/2020/wordml/sdtdatahash" xmlns:w16sdtfl="http://schemas.microsoft.com/office/word/2024/wordml/sdtformatlock" xmlns:w16se="http://schemas.microsoft.com/office/word/2015/wordml/symex" xmlns:w16du="http://schemas.microsoft.com/office/word/2023/wordml/word16du" xmlns:wne="http://schemas.microsoft.com/office/word/2006/wordml" mc:Ignorable="w14 w15 w16se w16cid w16 w16cex w16sdtdh w16sdtfl w16du wp14">
   <w:abstractNum w:abstractNumId="0" w15:restartNumberingAfterBreak="0">
     <w:nsid w:val="0355727F"/>
     <w:multiLevelType w:val="hybridMultilevel"/>
@@ -11014,7 +11118,7 @@
 </file>
 
 <file path=word/styles.xml><?xml version="1.0" encoding="utf-8"?>
-<w:styles xmlns:mc="http://schemas.openxmlformats.org/markup-compatibility/2006" xmlns:r="http://schemas.openxmlformats.org/officeDocument/2006/relationships" xmlns:w="http://schemas.openxmlformats.org/wordprocessingml/2006/main" xmlns:w14="http://schemas.microsoft.com/office/word/2010/wordml" xmlns:w15="http://schemas.microsoft.com/office/word/2012/wordml" xmlns:w16cex="http://schemas.microsoft.com/office/word/2018/wordml/cex" xmlns:w16cid="http://schemas.microsoft.com/office/word/2016/wordml/cid" xmlns:w16="http://schemas.microsoft.com/office/word/2018/wordml" xmlns:w16du="http://schemas.microsoft.com/office/word/2023/wordml/word16du" xmlns:w16sdtdh="http://schemas.microsoft.com/office/word/2020/wordml/sdtdatahash" xmlns:w16sdtfl="http://schemas.microsoft.com/office/word/2024/wordml/sdtformatlock" xmlns:w16se="http://schemas.microsoft.com/office/word/2015/wordml/symex" mc:Ignorable="w14 w15 w16se w16cid w16 w16cex w16sdtdh w16sdtfl w16du">
+<w:styles xmlns:mc="http://schemas.openxmlformats.org/markup-compatibility/2006" xmlns:r="http://schemas.openxmlformats.org/officeDocument/2006/relationships" xmlns:w="http://schemas.openxmlformats.org/wordprocessingml/2006/main" xmlns:w14="http://schemas.microsoft.com/office/word/2010/wordml" xmlns:w15="http://schemas.microsoft.com/office/word/2012/wordml" xmlns:w16cex="http://schemas.microsoft.com/office/word/2018/wordml/cex" xmlns:w16cid="http://schemas.microsoft.com/office/word/2016/wordml/cid" xmlns:w16="http://schemas.microsoft.com/office/word/2018/wordml" xmlns:w16sdtdh="http://schemas.microsoft.com/office/word/2020/wordml/sdtdatahash" xmlns:w16sdtfl="http://schemas.microsoft.com/office/word/2024/wordml/sdtformatlock" xmlns:w16se="http://schemas.microsoft.com/office/word/2015/wordml/symex" xmlns:w16du="http://schemas.microsoft.com/office/word/2023/wordml/word16du" mc:Ignorable="w14 w15 w16se w16cid w16 w16cex w16sdtdh w16sdtfl w16du">
   <w:docDefaults>
     <w:rPrDefault>
       <w:rPr>

</xml_diff>

<commit_message>
release: promote staging 4001eb4 to prod (#649-#674: all four work types in v2, Seal option, Kyle's Polish fixes, Sheets widget, v2 board, county and mileage lookups)
Prod data steps applied before merge: library_price_breaks.sql (3 nullable columns) and the workbook seed
(insert-only: 70 materials, 46 assemblies, labor lines and calculator rows).

Co-Authored-By: Claude Opus 5.5 <noreply@anthropic.com>
</commit_message>
<xml_diff>
--- a/backend/templates/GC/xx TREADWELL POLISH PROPOSAL - xx.docx
+++ b/backend/templates/GC/xx TREADWELL POLISH PROPOSAL - xx.docx
@@ -1112,7 +1112,7 @@
                                 <w:sz w:val="18"/>
                                 <w:szCs w:val="18"/>
                               </w:rPr>
-                              <w:t xml:space="preserve"> </w:t>
+                              <w:t xml:space="preserve">{{no_spec_note}}</w:t>
                             </w:r>
                             <w:r>
                               <w:rPr>
@@ -1124,7 +1124,7 @@
                                 <w:szCs w:val="18"/>
                                 <w:highlight w:val="yellow"/>
                               </w:rPr>
-                              <w:t>(</w:t>
+                              <w:t xml:space="preserve"/>
                             </w:r>
                             <w:r>
                               <w:rPr>
@@ -1137,7 +1137,7 @@
                                 <w:highlight w:val="yellow"/>
                                 <w:u w:val="single"/>
                               </w:rPr>
-                              <w:t>NO spec</w:t>
+                              <w:t xml:space="preserve"/>
                             </w:r>
                             <w:r>
                               <w:rPr>
@@ -1149,7 +1149,7 @@
                                 <w:szCs w:val="18"/>
                                 <w:highlight w:val="yellow"/>
                               </w:rPr>
-                              <w:t>)</w:t>
+                              <w:t xml:space="preserve"/>
                             </w:r>
                           </w:p>
                           <w:p>
@@ -2766,7 +2766,7 @@
                           <w:sz w:val="18"/>
                           <w:szCs w:val="18"/>
                         </w:rPr>
-                        <w:t xml:space="preserve"> </w:t>
+                        <w:t xml:space="preserve">{{no_spec_note}}</w:t>
                       </w:r>
                       <w:r>
                         <w:rPr>
@@ -2778,7 +2778,7 @@
                           <w:szCs w:val="18"/>
                           <w:highlight w:val="yellow"/>
                         </w:rPr>
-                        <w:t>(</w:t>
+                        <w:t xml:space="preserve"/>
                       </w:r>
                       <w:r>
                         <w:rPr>
@@ -2791,7 +2791,7 @@
                           <w:highlight w:val="yellow"/>
                           <w:u w:val="single"/>
                         </w:rPr>
-                        <w:t>NO spec</w:t>
+                        <w:t xml:space="preserve"/>
                       </w:r>
                       <w:r>
                         <w:rPr>
@@ -2803,7 +2803,7 @@
                           <w:szCs w:val="18"/>
                           <w:highlight w:val="yellow"/>
                         </w:rPr>
-                        <w:t>)</w:t>
+                        <w:t xml:space="preserve"/>
                       </w:r>
                     </w:p>
                     <w:p>

</xml_diff>